<commit_message>
se agrega files fase 2
</commit_message>
<xml_diff>
--- a/Fase 2/Evidencias Grupales/2.4_GuiaEstudiante_Fase 2_DesarrolloProyecto APT.docx
+++ b/Fase 2/Evidencias Grupales/2.4_GuiaEstudiante_Fase 2_DesarrolloProyecto APT.docx
@@ -736,6 +736,66 @@
               </w:rPr>
               <w:t xml:space="preserve"> detallada de productos</w:t>
             </w:r>
+            <w:r>
+              <w:rPr>
+                <w:rFonts w:ascii="Calibri" w:hAnsi="Calibri" w:cs="Arial"/>
+                <w:i w:val="1"/>
+                <w:iCs w:val="1"/>
+                <w:color w:val="548DD4"/>
+                <w:sz w:val="20"/>
+                <w:szCs w:val="20"/>
+                <w:lang w:eastAsia="es-CL"/>
+              </w:rPr>
+              <w:t xml:space="preserve">, Visualización de precios históricos, </w:t>
+            </w:r>
+            <w:r>
+              <w:rPr>
+                <w:rFonts w:ascii="Calibri" w:hAnsi="Calibri" w:cs="Arial"/>
+                <w:i w:val="1"/>
+                <w:iCs w:val="1"/>
+                <w:color w:val="548DD4"/>
+                <w:sz w:val="20"/>
+                <w:szCs w:val="20"/>
+                <w:lang w:eastAsia="es-CL"/>
+              </w:rPr>
+              <w:t xml:space="preserve">guardar productos favoritos, </w:t>
+            </w:r>
+            <w:r>
+              <w:rPr>
+                <w:rFonts w:ascii="Calibri" w:hAnsi="Calibri" w:cs="Arial"/>
+                <w:i w:val="1"/>
+                <w:iCs w:val="1"/>
+                <w:color w:val="548DD4"/>
+                <w:sz w:val="20"/>
+                <w:szCs w:val="20"/>
+                <w:lang w:eastAsia="es-CL"/>
+              </w:rPr>
+              <w:t xml:space="preserve">recibir notificaciones de bajas de precio, </w:t>
+            </w:r>
+            <w:r>
+              <w:rPr>
+                <w:rFonts w:ascii="Calibri" w:hAnsi="Calibri" w:cs="Arial"/>
+                <w:i w:val="1"/>
+                <w:iCs w:val="1"/>
+                <w:color w:val="548DD4"/>
+                <w:sz w:val="20"/>
+                <w:szCs w:val="20"/>
+                <w:lang w:eastAsia="es-CL"/>
+              </w:rPr>
+              <w:t>gestionar usuarios y productos.</w:t>
+            </w:r>
+            <w:r>
+              <w:rPr>
+                <w:rFonts w:ascii="Calibri" w:hAnsi="Calibri" w:cs="Arial"/>
+                <w:i w:val="1"/>
+                <w:iCs w:val="1"/>
+                <w:color w:val="548DD4"/>
+                <w:sz w:val="20"/>
+                <w:szCs w:val="20"/>
+                <w:lang w:eastAsia="es-CL"/>
+              </w:rPr>
+              <w:t xml:space="preserve"> </w:t>
+            </w:r>
           </w:p>
           <w:p>
             <w:pPr>
@@ -5284,81 +5344,50 @@
             <w:pPr>
               <w:spacing w:before="0" w:beforeAutospacing="off" w:after="0" w:afterAutospacing="off"/>
               <w:rPr>
-                <w:rFonts w:ascii="Calibri" w:hAnsi="Calibri" w:eastAsia="Calibri" w:cs="Calibri"/>
-                <w:b w:val="0"/>
-                <w:bCs w:val="0"/>
-                <w:i w:val="1"/>
-                <w:iCs w:val="1"/>
-                <w:caps w:val="0"/>
-                <w:smallCaps w:val="0"/>
-                <w:color w:val="548DD4"/>
-                <w:sz w:val="16"/>
-                <w:szCs w:val="16"/>
-              </w:rPr>
-            </w:pPr>
-            <w:r>
-              <w:rPr>
-                <w:rFonts w:ascii="Calibri" w:hAnsi="Calibri" w:eastAsia="Calibri" w:cs="Calibri" w:asciiTheme="minorAscii" w:hAnsiTheme="minorAscii" w:eastAsiaTheme="minorAscii" w:cstheme="minorBidi"/>
-                <w:b w:val="0"/>
-                <w:bCs w:val="0"/>
-                <w:i w:val="1"/>
-                <w:iCs w:val="1"/>
-                <w:caps w:val="0"/>
-                <w:smallCaps w:val="0"/>
-                <w:color w:val="548DD4"/>
-                <w:sz w:val="16"/>
-                <w:szCs w:val="16"/>
-                <w:lang w:eastAsia="en-US" w:bidi="ar-SA"/>
-              </w:rPr>
-              <w:t>Firebase</w:t>
-            </w:r>
-            <w:r>
-              <w:rPr>
-                <w:rFonts w:ascii="Calibri" w:hAnsi="Calibri" w:eastAsia="Calibri" w:cs="Calibri" w:asciiTheme="minorAscii" w:hAnsiTheme="minorAscii" w:eastAsiaTheme="minorAscii" w:cstheme="minorBidi"/>
-                <w:b w:val="0"/>
-                <w:bCs w:val="0"/>
-                <w:i w:val="1"/>
-                <w:iCs w:val="1"/>
-                <w:caps w:val="0"/>
-                <w:smallCaps w:val="0"/>
-                <w:color w:val="548DD4"/>
-                <w:sz w:val="16"/>
-                <w:szCs w:val="16"/>
-                <w:lang w:eastAsia="en-US" w:bidi="ar-SA"/>
-              </w:rPr>
-              <w:t xml:space="preserve"> Cloud </w:t>
-            </w:r>
-            <w:r>
-              <w:rPr>
-                <w:rFonts w:ascii="Calibri" w:hAnsi="Calibri" w:eastAsia="Calibri" w:cs="Calibri" w:asciiTheme="minorAscii" w:hAnsiTheme="minorAscii" w:eastAsiaTheme="minorAscii" w:cstheme="minorBidi"/>
-                <w:b w:val="0"/>
-                <w:bCs w:val="0"/>
-                <w:i w:val="1"/>
-                <w:iCs w:val="1"/>
-                <w:caps w:val="0"/>
-                <w:smallCaps w:val="0"/>
-                <w:color w:val="548DD4"/>
-                <w:sz w:val="16"/>
-                <w:szCs w:val="16"/>
-                <w:lang w:eastAsia="en-US" w:bidi="ar-SA"/>
-              </w:rPr>
-              <w:t>Messaging</w:t>
-            </w:r>
-            <w:r>
-              <w:rPr>
-                <w:rFonts w:ascii="Calibri" w:hAnsi="Calibri" w:eastAsia="Calibri" w:cs="Calibri" w:asciiTheme="minorAscii" w:hAnsiTheme="minorAscii" w:eastAsiaTheme="minorAscii" w:cstheme="minorBidi"/>
-                <w:b w:val="0"/>
-                <w:bCs w:val="0"/>
-                <w:i w:val="1"/>
-                <w:iCs w:val="1"/>
-                <w:caps w:val="0"/>
-                <w:smallCaps w:val="0"/>
-                <w:color w:val="548DD4"/>
-                <w:sz w:val="16"/>
-                <w:szCs w:val="16"/>
-                <w:lang w:eastAsia="en-US" w:bidi="ar-SA"/>
-              </w:rPr>
-              <w:t xml:space="preserve"> (FCM).</w:t>
+                <w:rFonts w:ascii="Calibri" w:hAnsi="Calibri" w:eastAsia="Calibri" w:cs="" w:asciiTheme="minorAscii" w:hAnsiTheme="minorAscii" w:eastAsiaTheme="minorAscii" w:cstheme="minorBidi"/>
+                <w:b w:val="0"/>
+                <w:bCs w:val="0"/>
+                <w:i w:val="1"/>
+                <w:iCs w:val="1"/>
+                <w:caps w:val="0"/>
+                <w:smallCaps w:val="0"/>
+                <w:color w:val="548DD4"/>
+                <w:sz w:val="16"/>
+                <w:szCs w:val="16"/>
+                <w:lang w:eastAsia="en-US" w:bidi="ar-SA"/>
+              </w:rPr>
+            </w:pPr>
+            <w:r>
+              <w:rPr>
+                <w:rFonts w:ascii="Calibri" w:hAnsi="Calibri" w:eastAsia="Calibri" w:cs="" w:asciiTheme="minorAscii" w:hAnsiTheme="minorAscii" w:eastAsiaTheme="minorAscii" w:cstheme="minorBidi"/>
+                <w:b w:val="0"/>
+                <w:bCs w:val="0"/>
+                <w:i w:val="1"/>
+                <w:iCs w:val="1"/>
+                <w:caps w:val="0"/>
+                <w:smallCaps w:val="0"/>
+                <w:color w:val="548DD4"/>
+                <w:sz w:val="16"/>
+                <w:szCs w:val="16"/>
+                <w:lang w:eastAsia="en-US" w:bidi="ar-SA"/>
+              </w:rPr>
+              <w:t>Capacitor local notifications</w:t>
+            </w:r>
+            <w:r>
+              <w:rPr>
+                <w:rFonts w:ascii="Calibri" w:hAnsi="Calibri" w:eastAsia="Calibri" w:cs="" w:asciiTheme="minorAscii" w:hAnsiTheme="minorAscii" w:eastAsiaTheme="minorAscii" w:cstheme="minorBidi"/>
+                <w:b w:val="0"/>
+                <w:bCs w:val="0"/>
+                <w:i w:val="1"/>
+                <w:iCs w:val="1"/>
+                <w:caps w:val="0"/>
+                <w:smallCaps w:val="0"/>
+                <w:color w:val="548DD4"/>
+                <w:sz w:val="16"/>
+                <w:szCs w:val="16"/>
+                <w:lang w:eastAsia="en-US" w:bidi="ar-SA"/>
+              </w:rPr>
+              <w:t>.</w:t>
             </w:r>
           </w:p>
         </w:tc>
@@ -7165,7 +7194,7 @@
                 <w:szCs w:val="20"/>
                 <w:lang w:eastAsia="es-CL"/>
               </w:rPr>
-              <w:t xml:space="preserve">Actividades pendientes a partir del sprint 2, aun no se inician ya que faltan pasos anteriores para evitar errores o ejecuciones fallidas. Es por esto </w:t>
+              <w:t xml:space="preserve">No hay </w:t>
             </w:r>
             <w:r>
               <w:rPr>
@@ -7177,7 +7206,7 @@
                 <w:szCs w:val="20"/>
                 <w:lang w:eastAsia="es-CL"/>
               </w:rPr>
-              <w:t>que</w:t>
+              <w:t>Actividades pendientes</w:t>
             </w:r>
             <w:r>
               <w:rPr>
@@ -7189,7 +7218,7 @@
                 <w:szCs w:val="20"/>
                 <w:lang w:eastAsia="es-CL"/>
               </w:rPr>
-              <w:t xml:space="preserve"> debemos apresurarnos para dar finalización a las 2 fases que nos quedan, por el momento no se requiere ajustes quizás futuramente debamos ajustar </w:t>
+              <w:t xml:space="preserve"> debido a que se ha completado cada sprint correctamente tanto sus historias de usuar</w:t>
             </w:r>
             <w:r>
               <w:rPr>
@@ -7201,7 +7230,31 @@
                 <w:szCs w:val="20"/>
                 <w:lang w:eastAsia="es-CL"/>
               </w:rPr>
-              <w:t>....</w:t>
+              <w:t>ios como sus correspondientes tareas</w:t>
+            </w:r>
+            <w:r>
+              <w:rPr>
+                <w:rFonts w:ascii="Calibri" w:hAnsi="Calibri" w:cs="Arial"/>
+                <w:i w:val="1"/>
+                <w:iCs w:val="1"/>
+                <w:color w:val="548DD4"/>
+                <w:sz w:val="20"/>
+                <w:szCs w:val="20"/>
+                <w:lang w:eastAsia="es-CL"/>
+              </w:rPr>
+              <w:t xml:space="preserve"> </w:t>
+            </w:r>
+            <w:r>
+              <w:rPr>
+                <w:rFonts w:ascii="Calibri" w:hAnsi="Calibri" w:cs="Arial"/>
+                <w:i w:val="1"/>
+                <w:iCs w:val="1"/>
+                <w:color w:val="548DD4"/>
+                <w:sz w:val="20"/>
+                <w:szCs w:val="20"/>
+                <w:lang w:eastAsia="es-CL"/>
+              </w:rPr>
+              <w:t>ya no se necesitan modificaciones ni cambios.</w:t>
             </w:r>
           </w:p>
         </w:tc>

</xml_diff>